<commit_message>
docs(lab5): update Tam week 5 report to match 5 core slide requirements and advanced deliverables
</commit_message>
<xml_diff>
--- a/docs/evidence/TV1/Lab05_2312741_NguyenThanhTam.docx
+++ b/docs/evidence/TV1/Lab05_2312741_NguyenThanhTam.docx
@@ -179,7 +179,7 @@
                 <w:b/>
                 <w:sz w:val="19"/>
               </w:rPr>
-              <w:t>[Cổng G6 — Triển khai Staging Nginx Multi-Container] Thiết lập môi trường Staging hoàn chỉnh với Docker Compose, Frontend Dockerfile và Gateway Nginx</w:t>
+              <w:t>[Yêu cầu 1 Lab 5 — Bảo mật] Hoàn thành cài đặt liên quan tới bảo mật như CORS, Rate Limiting, Authentication &amp; Authorization (RBAC)</w:t>
             </w:r>
           </w:p>
           <w:p>
@@ -202,40 +202,51 @@
               <w:rPr>
                 <w:sz w:val="17"/>
               </w:rPr>
-              <w:t>- Xây dựng cấu hình docker-compose.staging.yml liên kết 6 dịch vụ độc lập: culinary-db (Postgres 16), culinary-redis (Redis 7 AOF), culinary-s3 (RustFS S3-compatible), culinary-api (.NET 10 API), culinary-frontend (Next.js 15), culinary-nginx (Nginx Gateway).</w:t>
-            </w:r>
-          </w:p>
-          <w:p>
-            <w:pPr>
-              <w:spacing w:after="40"/>
-            </w:pPr>
-            <w:r>
-              <w:rPr>
-                <w:sz w:val="17"/>
-              </w:rPr>
-              <w:t>- Tạo src/frontend/Dockerfile đa tầng (multi-stage build: deps -&gt; builder -&gt; runner) tối ưu dung lượng và bảo mật container production.</w:t>
-            </w:r>
-          </w:p>
-          <w:p>
-            <w:pPr>
-              <w:spacing w:after="40"/>
-            </w:pPr>
-            <w:r>
-              <w:rPr>
-                <w:sz w:val="17"/>
-              </w:rPr>
-              <w:t>- Cấu hình nginx/nginx.staging.conf: reverse proxy định tuyến /api/, /health, /scalar/, /openapi/ vào backend và / vào frontend Next.js kèm Security Headers OWASP và gzip.</w:t>
-            </w:r>
-          </w:p>
-          <w:p>
-            <w:pPr>
-              <w:spacing w:after="40"/>
-            </w:pPr>
-            <w:r>
-              <w:rPr>
-                <w:sz w:val="17"/>
-              </w:rPr>
-              <w:t>- Cập nhật cấu hình cloud render.yaml phục vụ deploy tự động.</w:t>
+              <w:t>- CORS: Cấu hình chính sách app.UseCors(...) tại Program.cs cho phép các nguồn frontend tin cậy, đầy đủ phương thức HTTP (GET, POST, PUT, PATCH, DELETE, OPTIONS) và headers an toàn.</w:t>
+            </w:r>
+          </w:p>
+          <w:p>
+            <w:pPr>
+              <w:spacing w:after="40"/>
+            </w:pPr>
+            <w:r>
+              <w:rPr>
+                <w:sz w:val="17"/>
+              </w:rPr>
+              <w:t>- Rate Limiting: Cài đặt builder.Services.AddRateLimiter(...) với fixed window và sliding window bảo vệ các endpoint xác thực (/api/v1/auth), ngăn chặn tấn công brute-force và DDoS (trả HTTP 429 Too Many Requests kèm Retry-After).</w:t>
+            </w:r>
+          </w:p>
+          <w:p>
+            <w:pPr>
+              <w:spacing w:after="40"/>
+            </w:pPr>
+            <w:r>
+              <w:rPr>
+                <w:sz w:val="17"/>
+              </w:rPr>
+              <w:t>- Authentication &amp; Identity: Cài đặt ASP.NET Core Identity Core, mã hóa mật khẩu bằng PBKDF2 HMAC-SHA512 (100.000 iterations), cấp phát JWT Access Token (HS512 / HMAC-SHA256) và Refresh Token với cơ chế rotation &amp; family revocation bảo vệ đa phiên.</w:t>
+            </w:r>
+          </w:p>
+          <w:p>
+            <w:pPr>
+              <w:spacing w:after="40"/>
+            </w:pPr>
+            <w:r>
+              <w:rPr>
+                <w:sz w:val="17"/>
+              </w:rPr>
+              <w:t>- Authorization (RBAC): Thiết lập phân quyền theo vai trò (Admin, Author, User), xác minh quyền sở hữu bài viết tác giả và bảo vệ nghiêm ngặt các tài nguyên nhạy cảm (HTTP 401 Unauthorized, HTTP 403 Forbidden).</w:t>
+            </w:r>
+          </w:p>
+          <w:p>
+            <w:pPr>
+              <w:spacing w:after="40"/>
+            </w:pPr>
+            <w:r>
+              <w:rPr>
+                <w:sz w:val="17"/>
+              </w:rPr>
+              <w:t>- Account Lockout: Tự động khóa tài khoản tạm thời 15 phút sau 5 lần đăng nhập thất bại liên tiếp (HTTP 423 Locked).</w:t>
             </w:r>
           </w:p>
           <w:p>
@@ -271,7 +282,7 @@
               <w:rPr>
                 <w:sz w:val="15"/>
               </w:rPr>
-              <w:t>https://github.com/2312741-sudo/PTUDWNC-2026-Nhom16/tree/main/docker-compose.staging.yml</w:t>
+              <w:t>https://github.com/2312741-sudo/PTUDWNC-2026-Nhom16/tree/main/src/backend/CulinaryBlog.API/Program.cs</w:t>
             </w:r>
           </w:p>
         </w:tc>
@@ -324,7 +335,7 @@
                 <w:b/>
                 <w:sz w:val="19"/>
               </w:rPr>
-              <w:t>[Kế hoạch sao lưu &amp; Khôi phục CSDL BCP/DR] Xây dựng script sao lưu và phục hồi CSDL PostgreSQL tự động có mã kiểm tra toàn vẹn SHA-256</w:t>
+              <w:t>[Yêu cầu 2 Lab 5 — Đặc tả API &amp; Versioning] Hoàn thành việc cài đặt liên quan tới sinh tài liệu đặc tả API và API versioning</w:t>
             </w:r>
           </w:p>
           <w:p>
@@ -347,29 +358,29 @@
               <w:rPr>
                 <w:sz w:val="17"/>
               </w:rPr>
-              <w:t>- Xây dựng scripts/backup-db.sh: trích xuất CSDL bằng pg_dump, nén gzip trực tiếp (.sql.gz) và tạo mã băm kiểm tra tính toàn vẹn SHA-256 (.sha256).</w:t>
-            </w:r>
-          </w:p>
-          <w:p>
-            <w:pPr>
-              <w:spacing w:after="40"/>
-            </w:pPr>
-            <w:r>
-              <w:rPr>
-                <w:sz w:val="17"/>
-              </w:rPr>
-              <w:t>- Xây dựng scripts/restore-db.sh: tự động đối chiếu mã SHA-256 trước khi nạp vào CSDL; nạp dữ liệu an toàn và tự động kiểm tra xác nhận số lượng Categories, Recipes sau phục hồi.</w:t>
-            </w:r>
-          </w:p>
-          <w:p>
-            <w:pPr>
-              <w:spacing w:after="40"/>
-            </w:pPr>
-            <w:r>
-              <w:rPr>
-                <w:sz w:val="17"/>
-              </w:rPr>
-              <w:t>- Thực hiện diễn tập phục hồi thảm họa thực tế (Disaster Recovery Drill): phục hồi nguyên vẹn 25 danh mục và 100 công thức trong 1.8 giây (RTO &lt; 2 phút, RPO = 0).</w:t>
+              <w:t>- API Versioning: Chuẩn hóa toàn bộ 41 API endpoints theo cấu trúc phân phiên bản rõ ràng qua tiền tố URL /api/v1/... (Auth, Categories, Recipes, Publishing, Media, Health Probes).</w:t>
+            </w:r>
+          </w:p>
+          <w:p>
+            <w:pPr>
+              <w:spacing w:after="40"/>
+            </w:pPr>
+            <w:r>
+              <w:rPr>
+                <w:sz w:val="17"/>
+              </w:rPr>
+              <w:t>- Sinh đặc tả OpenAPI v1: Endpoint GET /openapi/v1.json tự động sinh lược đồ chuẩn OpenAPI 3.0, đặc tả chi tiết request schemas, query parameters, mã phản hồi HTTP, cấu trúc lỗi RFC 9457 Problem Details và lược đồ xác thực Bearer token.</w:t>
+            </w:r>
+          </w:p>
+          <w:p>
+            <w:pPr>
+              <w:spacing w:after="40"/>
+            </w:pPr>
+            <w:r>
+              <w:rPr>
+                <w:sz w:val="17"/>
+              </w:rPr>
+              <w:t>- Giao diện tài liệu API tương tác: Tích hợp Scalar UI hiện đại tại GET /scalar/v1, cho phép lập trình viên và người dùng tra cứu tài liệu, mô tả DTO và kiểm thử API trực tiếp trên trình duyệt.</w:t>
             </w:r>
           </w:p>
           <w:p>
@@ -405,7 +416,7 @@
               <w:rPr>
                 <w:sz w:val="15"/>
               </w:rPr>
-              <w:t>https://github.com/2312741-sudo/PTUDWNC-2026-Nhom16/tree/main/scripts/backup-db.sh</w:t>
+              <w:t>https://github.com/2312741-sudo/PTUDWNC-2026-Nhom16/tree/main/src/backend/CulinaryBlog.API/Program.cs</w:t>
             </w:r>
           </w:p>
         </w:tc>
@@ -458,7 +469,7 @@
                 <w:b/>
                 <w:sz w:val="19"/>
               </w:rPr>
-              <w:t>[Sao lưu kho lưu trữ Media &amp; Tệp tĩnh] Tự động hóa đóng gói và sao lưu kho ảnh công thức</w:t>
+              <w:t>[Yêu cầu 3 Lab 5 — Môi trường &amp; Cấu trúc Front-end] Hoàn thành việc cài đặt môi trường, xây dựng cấu trúc dự án phía front-end</w:t>
             </w:r>
           </w:p>
           <w:p>
@@ -481,18 +492,40 @@
               <w:rPr>
                 <w:sz w:val="17"/>
               </w:rPr>
-              <w:t>- Xây dựng script scripts/backup-storage.sh: tự động đóng gói toàn bộ thư mục ảnh chuẩn vị public/images/recipes thành định dạng .tar.gz (dung lượng 29MB).</w:t>
-            </w:r>
-          </w:p>
-          <w:p>
-            <w:pPr>
-              <w:spacing w:after="40"/>
-            </w:pPr>
-            <w:r>
-              <w:rPr>
-                <w:sz w:val="17"/>
-              </w:rPr>
-              <w:t>- Đảm bảo dữ liệu media luôn sẵn sàng phục hồi đồng bộ cùng cơ sở dữ liệu quan hệ.</w:t>
+              <w:t>- Thiết lập môi trường Next.js 15.1.11 trên nền React 19 và TypeScript 5.7 trong thư mục src/frontend/.</w:t>
+            </w:r>
+          </w:p>
+          <w:p>
+            <w:pPr>
+              <w:spacing w:after="40"/>
+            </w:pPr>
+            <w:r>
+              <w:rPr>
+                <w:sz w:val="17"/>
+              </w:rPr>
+              <w:t>- Xây dựng cấu trúc thư mục dự án chuẩn hóa theo App Router: src/app/ (routing: (auth), recipes, categories, dashboard), src/components/ (UI components tái sử dụng), src/lib/ (API client, token storage, schema validators), src/types/ (định nghĩa kiểu dữ liệu TS).</w:t>
+            </w:r>
+          </w:p>
+          <w:p>
+            <w:pPr>
+              <w:spacing w:after="40"/>
+            </w:pPr>
+            <w:r>
+              <w:rPr>
+                <w:sz w:val="17"/>
+              </w:rPr>
+              <w:t>- Cấu hình hệ thống kiểu dáng Tailwind CSS 3.4 và PostCSS đảm bảo giao diện đồng bộ, tốc độ tải tối ưu.</w:t>
+            </w:r>
+          </w:p>
+          <w:p>
+            <w:pPr>
+              <w:spacing w:after="40"/>
+            </w:pPr>
+            <w:r>
+              <w:rPr>
+                <w:sz w:val="17"/>
+              </w:rPr>
+              <w:t>- Xây dựng src/frontend/Dockerfile đa tầng (deps -&gt; builder -&gt; runner) đóng gói container production gọn nhẹ và an toàn.</w:t>
             </w:r>
           </w:p>
           <w:p>
@@ -528,7 +561,7 @@
               <w:rPr>
                 <w:sz w:val="15"/>
               </w:rPr>
-              <w:t>https://github.com/2312741-sudo/PTUDWNC-2026-Nhom16/tree/main/scripts/backup-storage.sh</w:t>
+              <w:t>https://github.com/2312741-sudo/PTUDWNC-2026-Nhom16/tree/main/src/frontend</w:t>
             </w:r>
           </w:p>
         </w:tc>
@@ -581,7 +614,7 @@
                 <w:b/>
                 <w:sz w:val="19"/>
               </w:rPr>
-              <w:t>[Kiểm thử E2E — Kịch bản 1 (Cổng G6)] Vòng đời xác thực và an toàn tài khoản toàn diện</w:t>
+              <w:t>[Yêu cầu 4 Lab 5 — Thư viện cần thiết] Hoàn thành việc cài đặt và cấu hình các thư viện cần thiết phía front-end và back-end</w:t>
             </w:r>
           </w:p>
           <w:p>
@@ -604,18 +637,18 @@
               <w:rPr>
                 <w:sz w:val="17"/>
               </w:rPr>
-              <w:t>- Cài đặt bài test tự động E2E_Scenario_1_Full_Auth_Lifecycle_Profile_ChangePassword_And_Revocation trong Week5StagingAndE2ETests.cs.</w:t>
-            </w:r>
-          </w:p>
-          <w:p>
-            <w:pPr>
-              <w:spacing w:after="40"/>
-            </w:pPr>
-            <w:r>
-              <w:rPr>
-                <w:sz w:val="17"/>
-              </w:rPr>
-              <w:t>- Kiểm chứng luồng khép kín: Đăng ký tài khoản mới ➔ Lấy hồ sơ ➔ Chống XSS độc hại (400) &amp; Cập nhật tên hợp lệ (200) ➔ Đổi mật khẩu thành công (204) ➔ Thu hồi toàn bộ Refresh Token của phiên cũ (401) ➔ Đăng nhập thành công bằng mật khẩu mới (200) ➔ Đăng xuất an toàn và vô hiệu hóa token (204).</w:t>
+              <w:t>- Cài đặt thư viện Front-end: next, react, react-dom, @tanstack/react-query (quản lý server state/cache), react-hook-form &amp; @hookform/resolvers (quản lý form), zod (kiểm tra hợp lệ schema), lucide-react (icon hệ thống), clsx &amp; tailwind-merge (xử lý class CSS), jest &amp; playwright (kiểm thử).</w:t>
+            </w:r>
+          </w:p>
+          <w:p>
+            <w:pPr>
+              <w:spacing w:after="40"/>
+            </w:pPr>
+            <w:r>
+              <w:rPr>
+                <w:sz w:val="17"/>
+              </w:rPr>
+              <w:t>- Cài đặt thư viện Back-end: Npgsql.EntityFrameworkCore.PostgreSQL (truy cập CSDL), Microsoft.AspNetCore.Authentication.JwtBearer (xác thực JWT), FluentValidation (kiểm tra dữ liệu đầu vào), StackExchange.Redis (bộ đệm phân tán), Minio (lưu trữ tệp S3), Serilog &amp; OpenTelemetry (quan sát hệ thống), Scalar.AspNetCore (tài liệu API).</w:t>
             </w:r>
           </w:p>
           <w:p>
@@ -651,7 +684,7 @@
               <w:rPr>
                 <w:sz w:val="15"/>
               </w:rPr>
-              <w:t>https://github.com/2312741-sudo/PTUDWNC-2026-Nhom16/tree/main/tests/CulinaryBlog.Tests/Week5StagingAndE2ETests.cs</w:t>
+              <w:t>https://github.com/2312741-sudo/PTUDWNC-2026-Nhom16/tree/main/src/frontend/package.json</w:t>
             </w:r>
           </w:p>
         </w:tc>
@@ -704,7 +737,7 @@
                 <w:b/>
                 <w:sz w:val="19"/>
               </w:rPr>
-              <w:t>[Kiểm thử E2E — Kịch bản 2 (Cổng G6)] Phân quyền RBAC, Chống dò quét Brute-Force &amp; Account Lockout</w:t>
+              <w:t>[Yêu cầu 5 Lab 5 — Kiểu dữ liệu TS] Cài đặt các kiểu dữ liệu (TS types &amp; Zod schemas) cần thiết được dùng bởi ứng dụng phía front-end</w:t>
             </w:r>
           </w:p>
           <w:p>
@@ -727,29 +760,51 @@
               <w:rPr>
                 <w:sz w:val="17"/>
               </w:rPr>
-              <w:t>- Cài đặt bài test tự động E2E_Scenario_2_RBAC_Authorization_And_BruteForce_Lockout_Protection trong Week5StagingAndE2ETests.cs.</w:t>
-            </w:r>
-          </w:p>
-          <w:p>
-            <w:pPr>
-              <w:spacing w:after="40"/>
-            </w:pPr>
-            <w:r>
-              <w:rPr>
-                <w:sz w:val="17"/>
-              </w:rPr>
-              <w:t>- Kiểm chứng phân quyền: User/Author cố truy cập tài nguyên Admin bị từ chối 403 Forbidden; truy cập không kèm Bearer Token bị 401 Unauthorized.</w:t>
-            </w:r>
-          </w:p>
-          <w:p>
-            <w:pPr>
-              <w:spacing w:after="40"/>
-            </w:pPr>
-            <w:r>
-              <w:rPr>
-                <w:sz w:val="17"/>
-              </w:rPr>
-              <w:t>- Kiểm chứng phòng thủ Brute-force: Tự động khóa tài khoản (Account Lockout) sau 5 lần nhập sai liên tiếp.</w:t>
+              <w:t>- Kiểu xác thực &amp; người dùng: User, AuthResponse, LoginRequest, RegisterRequest, UpdateProfileRequest trong src/types/auth.ts.</w:t>
+            </w:r>
+          </w:p>
+          <w:p>
+            <w:pPr>
+              <w:spacing w:after="40"/>
+            </w:pPr>
+            <w:r>
+              <w:rPr>
+                <w:sz w:val="17"/>
+              </w:rPr>
+              <w:t>- Kiểu danh mục: Category, CreateCategoryRequest, UpdateCategoryRequest trong src/types/category.ts.</w:t>
+            </w:r>
+          </w:p>
+          <w:p>
+            <w:pPr>
+              <w:spacing w:after="40"/>
+            </w:pPr>
+            <w:r>
+              <w:rPr>
+                <w:sz w:val="17"/>
+              </w:rPr>
+              <w:t>- Kiểu công thức &amp; đa phương tiện: RecipeSummary, RecipeDetail, RecipeIngredient, RecipeStep, RecipeNutrition, RecipeImageSummary, RecipeFilters trong src/types/recipe.ts.</w:t>
+            </w:r>
+          </w:p>
+          <w:p>
+            <w:pPr>
+              <w:spacing w:after="40"/>
+            </w:pPr>
+            <w:r>
+              <w:rPr>
+                <w:sz w:val="17"/>
+              </w:rPr>
+              <w:t>- Kiểu bao gói API &amp; phân trang: ApiResponse&lt;T&gt;, PagedResult&lt;T&gt;, PaginationMeta, ApiProblemDetails trong src/lib/api.ts.</w:t>
+            </w:r>
+          </w:p>
+          <w:p>
+            <w:pPr>
+              <w:spacing w:after="40"/>
+            </w:pPr>
+            <w:r>
+              <w:rPr>
+                <w:sz w:val="17"/>
+              </w:rPr>
+              <w:t>- Kiểu dữ liệu kiểm tra runtime qua Zod: RecipeFormValues, IngredientInput, StepInput trong src/lib/recipe-schemas.ts.</w:t>
             </w:r>
           </w:p>
           <w:p>
@@ -785,7 +840,7 @@
               <w:rPr>
                 <w:sz w:val="15"/>
               </w:rPr>
-              <w:t>https://github.com/2312741-sudo/PTUDWNC-2026-Nhom16/tree/main/tests/CulinaryBlog.Tests/Week5StagingAndE2ETests.cs</w:t>
+              <w:t>https://github.com/2312741-sudo/PTUDWNC-2026-Nhom16/tree/main/src/frontend/src/types</w:t>
             </w:r>
           </w:p>
         </w:tc>
@@ -838,7 +893,7 @@
                 <w:b/>
                 <w:sz w:val="19"/>
               </w:rPr>
-              <w:t>[Kiểm thử E2E — Kịch bản 3 (Cổng G6)] Toàn vẹn dữ liệu &amp; Khóa lạc quan (OCC) ngăn chặn Lost Update</w:t>
+              <w:t>[Nâng cao Tuần 5 — Cổng G6] Môi trường Staging Nginx Đa Container &amp; Triển khai Độc lập</w:t>
             </w:r>
           </w:p>
           <w:p>
@@ -861,18 +916,29 @@
               <w:rPr>
                 <w:sz w:val="17"/>
               </w:rPr>
-              <w:t>- Cài đặt bài test tự động E2E_Scenario_3_Optimistic_Concurrency_Control_Prevents_Lost_Updates trong Week5StagingAndE2ETests.cs.</w:t>
-            </w:r>
-          </w:p>
-          <w:p>
-            <w:pPr>
-              <w:spacing w:after="40"/>
-            </w:pPr>
-            <w:r>
-              <w:rPr>
-                <w:sz w:val="17"/>
-              </w:rPr>
-              <w:t>- Kiểm chứng tình huống 2 tác giả cùng ghi đồng thời: Writer 1 cập nhật thành công làm thay đổi RowVersion / xmin; Writer 2 gửi cập nhật với token cũ bị từ chối ngay lập tức với HTTP 422 Unprocessable Entity kèm mã lỗi recipe.version_conflict.</w:t>
+              <w:t>- Xây dựng docker-compose.staging.yml tích hợp 6 dịch vụ độc lập: culinary-db (Postgres 16), culinary-redis (Redis 7 AOF), culinary-s3 (RustFS S3), culinary-api (.NET 10 API), culinary-frontend (Next.js 15), culinary-nginx (Nginx Gateway).</w:t>
+            </w:r>
+          </w:p>
+          <w:p>
+            <w:pPr>
+              <w:spacing w:after="40"/>
+            </w:pPr>
+            <w:r>
+              <w:rPr>
+                <w:sz w:val="17"/>
+              </w:rPr>
+              <w:t>- Cấu hình nginx/nginx.staging.conf: reverse proxy định tuyến /api/, /health, /scalar/, /openapi/ vào backend và / vào frontend Next.js kèm Security Headers OWASP và nén Gzip.</w:t>
+            </w:r>
+          </w:p>
+          <w:p>
+            <w:pPr>
+              <w:spacing w:after="40"/>
+            </w:pPr>
+            <w:r>
+              <w:rPr>
+                <w:sz w:val="17"/>
+              </w:rPr>
+              <w:t>- Cập nhật hạ tầng Cloud render.yaml phục vụ CI/CD tự động.</w:t>
             </w:r>
           </w:p>
           <w:p>
@@ -908,7 +974,7 @@
               <w:rPr>
                 <w:sz w:val="15"/>
               </w:rPr>
-              <w:t>https://github.com/2312741-sudo/PTUDWNC-2026-Nhom16/tree/main/tests/CulinaryBlog.Tests/Week5StagingAndE2ETests.cs</w:t>
+              <w:t>https://github.com/2312741-sudo/PTUDWNC-2026-Nhom16/tree/main/docker-compose.staging.yml</w:t>
             </w:r>
           </w:p>
         </w:tc>
@@ -961,7 +1027,7 @@
                 <w:b/>
                 <w:sz w:val="19"/>
               </w:rPr>
-              <w:t>[Kiểm thử E2E — Kịch bản 4 (Cổng G6)] Khả năng phục hồi (Resilient Fallback) &amp; Health Probes</w:t>
+              <w:t>[Nâng cao Tuần 5 — BCP/DR] Kế hoạch sao lưu &amp; Phục hồi CSDL tự động có mã kiểm tra toàn vẹn SHA-256</w:t>
             </w:r>
           </w:p>
           <w:p>
@@ -984,18 +1050,40 @@
               <w:rPr>
                 <w:sz w:val="17"/>
               </w:rPr>
-              <w:t>- Cài đặt bài test tự động E2E_Scenario_4_Resilient_Health_Probes_And_Graceful_Degradation trong Week5StagingAndE2ETests.cs.</w:t>
-            </w:r>
-          </w:p>
-          <w:p>
-            <w:pPr>
-              <w:spacing w:after="40"/>
-            </w:pPr>
-            <w:r>
-              <w:rPr>
-                <w:sz w:val="17"/>
-              </w:rPr>
-              <w:t>- Kiểm chứng Liveness Probe /health/live trả 200 OK; khi Redis hoặc RustFS ngoại tuyến, hệ thống ghi log cảnh báo và tự động fallback về CSDL PostgreSQL an toàn, không ném lỗi HTTP 500 ra người dùng.</w:t>
+              <w:t>- Xây dựng scripts/backup-db.sh: trích xuất CSDL bằng pg_dump, nén gzip (.sql.gz) và sinh mã băm kiểm tra tính toàn vẹn SHA-256 (.sha256).</w:t>
+            </w:r>
+          </w:p>
+          <w:p>
+            <w:pPr>
+              <w:spacing w:after="40"/>
+            </w:pPr>
+            <w:r>
+              <w:rPr>
+                <w:sz w:val="17"/>
+              </w:rPr>
+              <w:t>- Xây dựng scripts/restore-db.sh: tự động đối chiếu mã SHA-256 trước khi nạp; nạp dữ liệu an toàn và tự động kiểm tra số lượng 25 danh mục và 100 công thức sau phục hồi.</w:t>
+            </w:r>
+          </w:p>
+          <w:p>
+            <w:pPr>
+              <w:spacing w:after="40"/>
+            </w:pPr>
+            <w:r>
+              <w:rPr>
+                <w:sz w:val="17"/>
+              </w:rPr>
+              <w:t>- Xây dựng scripts/backup-storage.sh: tự động đóng gói toàn bộ thư mục ảnh chuẩn vị recipes thành định dạng .tar.gz (dung lượng 29MB).</w:t>
+            </w:r>
+          </w:p>
+          <w:p>
+            <w:pPr>
+              <w:spacing w:after="40"/>
+            </w:pPr>
+            <w:r>
+              <w:rPr>
+                <w:sz w:val="17"/>
+              </w:rPr>
+              <w:t>- Diễn tập phục hồi thảm họa thực tế (Disaster Recovery Drill): phục hồi nguyên vẹn 25 danh mục và 100 công thức trong 1.8 giây (RTO &lt; 2 phút, RPO = 0).</w:t>
             </w:r>
           </w:p>
           <w:p>
@@ -1031,7 +1119,7 @@
               <w:rPr>
                 <w:sz w:val="15"/>
               </w:rPr>
-              <w:t>https://github.com/2312741-sudo/PTUDWNC-2026-Nhom16/tree/main/tests/CulinaryBlog.Tests/Week5StagingAndE2ETests.cs</w:t>
+              <w:t>https://github.com/2312741-sudo/PTUDWNC-2026-Nhom16/tree/main/scripts/backup-db.sh</w:t>
             </w:r>
           </w:p>
         </w:tc>
@@ -1084,7 +1172,7 @@
                 <w:b/>
                 <w:sz w:val="19"/>
               </w:rPr>
-              <w:t>[Kiểm thử E2E — Kịch bản 5 (Cổng G6)] Tìm kiếm FTS không dấu tiếng Việt, Bộ lọc AND &amp; Phân lập dữ liệu Draft</w:t>
+              <w:t>[Nâng cao Tuần 5 — 5 Kịch bản E2E Cổng G6] Kiểm thử tích hợp tự động khép kín toàn diện</w:t>
             </w:r>
           </w:p>
           <w:p>
@@ -1107,18 +1195,62 @@
               <w:rPr>
                 <w:sz w:val="17"/>
               </w:rPr>
-              <w:t>- Cài đặt bài test tự động E2E_Scenario_5_FTS_Vietnamese_Search_AND_Filter_And_Draft_Isolation trong Week5StagingAndE2ETests.cs.</w:t>
-            </w:r>
-          </w:p>
-          <w:p>
-            <w:pPr>
-              <w:spacing w:after="40"/>
-            </w:pPr>
-            <w:r>
-              <w:rPr>
-                <w:sz w:val="17"/>
-              </w:rPr>
-              <w:t>- Kiểm chứng FTS Trigram GIN index: từ khóa không dấu "canh" tìm thấy chính xác công thức "Canh chua cá lóc"; kết hợp phân trang pageSize; xác thực kết quả tìm kiếm công khai tuyệt đối không chứa công thức ở trạng thái Draft.</w:t>
+              <w:t>- Cài đặt 5 bài test tự động chuyên sâu trong tests/CulinaryBlog.Tests/Week5StagingAndE2ETests.cs:</w:t>
+            </w:r>
+          </w:p>
+          <w:p>
+            <w:pPr>
+              <w:spacing w:after="40"/>
+            </w:pPr>
+            <w:r>
+              <w:rPr>
+                <w:sz w:val="17"/>
+              </w:rPr>
+              <w:t>- + Kịch bản 1: Vòng đời xác thực đầy đủ (Register ➔ Get profile ➔ Anti-XSS validation ➔ Change password ➔ Revoke token ➔ Re-login ➔ Logout).</w:t>
+            </w:r>
+          </w:p>
+          <w:p>
+            <w:pPr>
+              <w:spacing w:after="40"/>
+            </w:pPr>
+            <w:r>
+              <w:rPr>
+                <w:sz w:val="17"/>
+              </w:rPr>
+              <w:t>- + Kịch bản 2: Phân quyền RBAC (chặn 403 Forbidden / 401 Unauthorized) và Account Lockout 423 sau 5 lần brute-force.</w:t>
+            </w:r>
+          </w:p>
+          <w:p>
+            <w:pPr>
+              <w:spacing w:after="40"/>
+            </w:pPr>
+            <w:r>
+              <w:rPr>
+                <w:sz w:val="17"/>
+              </w:rPr>
+              <w:t>- + Kịch bản 3: Khóa lạc quan OCC với RowVersion ngăn chặn Lost Update, trả HTTP 422 recipe.version_conflict.</w:t>
+            </w:r>
+          </w:p>
+          <w:p>
+            <w:pPr>
+              <w:spacing w:after="40"/>
+            </w:pPr>
+            <w:r>
+              <w:rPr>
+                <w:sz w:val="17"/>
+              </w:rPr>
+              <w:t>- + Kịch bản 4: Resilient fallback &amp; Liveness probes khi storage/cache ngoại tuyến, không ném 500 ra người dùng.</w:t>
+            </w:r>
+          </w:p>
+          <w:p>
+            <w:pPr>
+              <w:spacing w:after="40"/>
+            </w:pPr>
+            <w:r>
+              <w:rPr>
+                <w:sz w:val="17"/>
+              </w:rPr>
+              <w:t>- + Kịch bản 5: Tìm kiếm FTS không dấu tiếng Việt kết hợp phân trang pageSize và bảo vệ phân lập tuyệt đối dữ liệu Draft.</w:t>
             </w:r>
           </w:p>
           <w:p>
@@ -1207,7 +1339,7 @@
                 <w:b/>
                 <w:sz w:val="19"/>
               </w:rPr>
-              <w:t>[Đo lường Hiệu năng Tải &amp; Benchmarking] Đo lường thông lượng Throughput RPS và độ trễ p95</w:t>
+              <w:t>[Nâng cao Tuần 5 — Đo lường Hiệu năng &amp; Tải] Đo lường thông lượng Throughput RPS và độ trễ p95</w:t>
             </w:r>
           </w:p>
           <w:p>
@@ -1374,7 +1506,7 @@
                 <w:b/>
                 <w:sz w:val="19"/>
               </w:rPr>
-              <w:t>[Review Task TV4 &amp; Hồ sơ Quyết định Kiến trúc ADR-0004] Nghiệm thu kỹ thuật và duy trì 183/183 tests xanh</w:t>
+              <w:t>[Nâng cao Tuần 5 — Nghiệm thu &amp; ADR-0004] Duy trì 426/426 bài test tự động pass 100% và ban hành ADR-0004</w:t>
             </w:r>
           </w:p>
           <w:p>
@@ -1397,29 +1529,18 @@
               <w:rPr>
                 <w:sz w:val="17"/>
               </w:rPr>
-              <w:t>- Rà soát và nghiệm thu các đề xuất B1, B2, B3 của TV4 (chuyển mã lỗi storage sang 503, fail-fast config, nạp .env qua DotNetEnv).</w:t>
-            </w:r>
-          </w:p>
-          <w:p>
-            <w:pPr>
-              <w:spacing w:after="40"/>
-            </w:pPr>
-            <w:r>
-              <w:rPr>
-                <w:sz w:val="17"/>
-              </w:rPr>
-              <w:t>- Viết và ban hành ADR-0004: Chiến Lược Triển Khai Staging Đa Container, Sao Lưu &amp; Phục Hồi Dữ Liệu Tự Động (BCP/DR).</w:t>
-            </w:r>
-          </w:p>
-          <w:p>
-            <w:pPr>
-              <w:spacing w:after="40"/>
-            </w:pPr>
-            <w:r>
-              <w:rPr>
-                <w:sz w:val="17"/>
-              </w:rPr>
-              <w:t>- Đạt 183/183 bài test tự động pass 100% (178 tests CulinaryBlog.Tests + 5 tests ConcurrencySpike).</w:t>
+              <w:t>- Ban hành ADR-0004: Chiến Lược Triển Khai Staging Đa Container, Sao Lưu &amp; Phục Hồi Dữ Liệu Tự Động (BCP/DR).</w:t>
+            </w:r>
+          </w:p>
+          <w:p>
+            <w:pPr>
+              <w:spacing w:after="40"/>
+            </w:pPr>
+            <w:r>
+              <w:rPr>
+                <w:sz w:val="17"/>
+              </w:rPr>
+              <w:t>- Đạt 426/426 bài test tự động pass 100% (421 bài test CulinaryBlog.Tests + 5 bài test ConcurrencySpike).</w:t>
             </w:r>
           </w:p>
           <w:p>
@@ -1431,6 +1552,17 @@
                 <w:sz w:val="17"/>
               </w:rPr>
               <w:t>- Biên dịch npm run build Next.js 15 thành công 15/15 routes.</w:t>
+            </w:r>
+          </w:p>
+          <w:p>
+            <w:pPr>
+              <w:spacing w:after="40"/>
+            </w:pPr>
+            <w:r>
+              <w:rPr>
+                <w:sz w:val="17"/>
+              </w:rPr>
+              <w:t>- Khắc phục triệt để lỗi deployment Render (bổ sung lib Kerberos/GSSAPI trong Dockerfile và cấu hình an toàn cho Minio).</w:t>
             </w:r>
           </w:p>
           <w:p>

</xml_diff>